<commit_message>
docs: record integration acceptance and prepare installation and presentation guides
</commit_message>
<xml_diff>
--- a/docs/report/Bao_Cao_SmartCart.docx
+++ b/docs/report/Bao_Cao_SmartCart.docx
@@ -569,14 +569,12 @@
     </w:p>
     <w:p>
       <w:r>
-        <w:rPr/>
-        <w:t>Ngày cập nhật: 13/10/2026</w:t>
+        <w:t>Ngày cập nhật: 18/10/2026</w:t>
       </w:r>
     </w:p>
     <w:p>
       <w:r>
-        <w:rPr/>
-        <w:t>Nhóm xây dựng SmartCart để quản lý danh mục, sản phẩm và đơn hàng, đồng thời cung cấp giỏ hàng tương tác cho khách hàng. Nội dung hiện có tập trung vào yêu cầu, thiết kế và bộ khung đã triển khai. Các chức năng của thành viên 2–4 và kết quả demo toàn hệ thống sẽ được bổ sung khi hoàn thành.</w:t>
+        <w:t>SmartCart đã tích hợp nền tảng, CRUD, giỏ hàng, giao diện khách và quản lý đơn trên nhánh integration/admin-cart. Báo cáo cập nhật kết quả kiểm thử và ảnh demo. Việc cài trên máy vật lý thứ hai và các ca nghiệm thu còn mở được ghi riêng, chưa xác nhận đạt.</w:t>
       </w:r>
     </w:p>
     <w:p>
@@ -821,15 +819,8 @@
             <w:vAlign w:val="center"/>
           </w:tcPr>
           <w:p>
-            <w:pPr>
-              <w:spacing w:after="60" w:line="252" w:lineRule="auto"/>
-            </w:pPr>
             <w:r>
-              <w:rPr>
-                <w:b w:val="0"/>
-                <w:sz w:val="21"/>
-              </w:rPr>
-              <w:t>Đã triển khai</w:t>
+              <w:t>Đã tích hợp; xem phạm vi nghiệm thu ở phần 5</w:t>
             </w:r>
           </w:p>
         </w:tc>
@@ -888,15 +879,8 @@
             <w:vAlign w:val="center"/>
           </w:tcPr>
           <w:p>
-            <w:pPr>
-              <w:spacing w:after="60" w:line="252" w:lineRule="auto"/>
-            </w:pPr>
             <w:r>
-              <w:rPr>
-                <w:b w:val="0"/>
-                <w:sz w:val="21"/>
-              </w:rPr>
-              <w:t>Layout chung, form Auth, trang tài khoản</w:t>
+              <w:t>Layout khách/Admin, các biểu mẫu và bảng responsive</w:t>
             </w:r>
           </w:p>
         </w:tc>
@@ -919,15 +903,8 @@
             <w:vAlign w:val="center"/>
           </w:tcPr>
           <w:p>
-            <w:pPr>
-              <w:spacing w:after="60" w:line="252" w:lineRule="auto"/>
-            </w:pPr>
             <w:r>
-              <w:rPr>
-                <w:b w:val="0"/>
-                <w:sz w:val="21"/>
-              </w:rPr>
-              <w:t>Đã có nền</w:t>
+              <w:t>Đã tích hợp; xem phạm vi nghiệm thu ở phần 5</w:t>
             </w:r>
           </w:p>
         </w:tc>
@@ -1017,15 +994,8 @@
             <w:vAlign w:val="center"/>
           </w:tcPr>
           <w:p>
-            <w:pPr>
-              <w:spacing w:after="60" w:line="252" w:lineRule="auto"/>
-            </w:pPr>
             <w:r>
-              <w:rPr>
-                <w:b w:val="0"/>
-                <w:sz w:val="21"/>
-              </w:rPr>
-              <w:t>Đã triển khai</w:t>
+              <w:t>Đã tích hợp; xem phạm vi nghiệm thu ở phần 5</w:t>
             </w:r>
           </w:p>
         </w:tc>
@@ -1115,15 +1085,8 @@
             <w:vAlign w:val="center"/>
           </w:tcPr>
           <w:p>
-            <w:pPr>
-              <w:spacing w:after="60" w:line="252" w:lineRule="auto"/>
-            </w:pPr>
             <w:r>
-              <w:rPr>
-                <w:b w:val="0"/>
-                <w:sz w:val="21"/>
-              </w:rPr>
-              <w:t>Chờ TV2</w:t>
+              <w:t>Đã tích hợp; xem phạm vi nghiệm thu ở phần 5</w:t>
             </w:r>
           </w:p>
         </w:tc>
@@ -1213,15 +1176,8 @@
             <w:vAlign w:val="center"/>
           </w:tcPr>
           <w:p>
-            <w:pPr>
-              <w:spacing w:after="60" w:line="252" w:lineRule="auto"/>
-            </w:pPr>
             <w:r>
-              <w:rPr>
-                <w:b w:val="0"/>
-                <w:sz w:val="21"/>
-              </w:rPr>
-              <w:t>Chờ TV3</w:t>
+              <w:t>Đã tích hợp; xem phạm vi nghiệm thu ở phần 5</w:t>
             </w:r>
           </w:p>
         </w:tc>
@@ -1280,15 +1236,8 @@
             <w:vAlign w:val="center"/>
           </w:tcPr>
           <w:p>
-            <w:pPr>
-              <w:spacing w:after="60" w:line="252" w:lineRule="auto"/>
-            </w:pPr>
             <w:r>
-              <w:rPr>
-                <w:b w:val="0"/>
-                <w:sz w:val="21"/>
-              </w:rPr>
-              <w:t>Auth đã có; CRUD/checkout cần bổ sung</w:t>
+              <w:t>Auth, CRUD, upload và checkout dùng validation server</w:t>
             </w:r>
           </w:p>
         </w:tc>
@@ -1311,15 +1260,8 @@
             <w:vAlign w:val="center"/>
           </w:tcPr>
           <w:p>
-            <w:pPr>
-              <w:spacing w:after="60" w:line="252" w:lineRule="auto"/>
-            </w:pPr>
             <w:r>
-              <w:rPr>
-                <w:b w:val="0"/>
-                <w:sz w:val="21"/>
-              </w:rPr>
-              <w:t>Hoàn thành một phần</w:t>
+              <w:t>Đã tích hợp; xem phạm vi nghiệm thu ở phần 5</w:t>
             </w:r>
           </w:p>
         </w:tc>
@@ -1409,15 +1351,8 @@
             <w:vAlign w:val="center"/>
           </w:tcPr>
           <w:p>
-            <w:pPr>
-              <w:spacing w:after="60" w:line="252" w:lineRule="auto"/>
-            </w:pPr>
             <w:r>
-              <w:rPr>
-                <w:b w:val="0"/>
-                <w:sz w:val="21"/>
-              </w:rPr>
-              <w:t>Đang hoàn thiện</w:t>
+              <w:t>Đã tích hợp; xem phạm vi nghiệm thu ở phần 5</w:t>
             </w:r>
           </w:p>
         </w:tc>
@@ -1438,8 +1373,7 @@
     </w:p>
     <w:p>
       <w:r>
-        <w:rPr/>
-        <w:t>Upload ảnh sản phẩm, giỏ hàng và tìm kiếm bằng Fetch API, tiện ích tỷ giá/thời tiết và responsive là phạm vi mở rộng. Các chức năng này được phân công cho thành viên 2–4. Thanh toán trực tuyến chưa thuộc phạm vi đề tài hiện tại.</w:t>
+        <w:t>Đã tích hợp upload ảnh, giỏ hàng và live search bằng Fetch API, SweetAlert2 và widget thời tiết Open-Meteo. Đã thử các màn hình ở 375, 768 và 1440 px; chưa thay thế kiểm tra mọi thiết bị thật. Thanh toán trực tuyến không thuộc phạm vi; checkout dùng COD, miễn phí giao hàng.</w:t>
       </w:r>
     </w:p>
     <w:p>
@@ -1508,8 +1442,7 @@
         <w:jc w:val="center"/>
       </w:pPr>
       <w:r>
-        <w:rPr/>
-        <w:t>Hình 1 ERD SmartCart theo cấu trúc migration ngày 13/10/2026</w:t>
+        <w:t>Hình 1 ERD cấu trúc nền SmartCart; orders được bổ sung checkout_token nullable unique bằng migration 17/10/2026.</w:t>
       </w:r>
     </w:p>
     <w:p>
@@ -1988,15 +1921,8 @@
             <w:vAlign w:val="center"/>
           </w:tcPr>
           <w:p>
-            <w:pPr>
-              <w:spacing w:after="60" w:line="252" w:lineRule="auto"/>
-            </w:pPr>
             <w:r>
-              <w:rPr>
-                <w:b w:val="0"/>
-                <w:sz w:val="22"/>
-              </w:rPr>
-              <w:t>total_amount, status, shipping_address, phone, note</w:t>
+              <w:t>total_amount, status, shipping_address, phone, note, checkout_token (UUID nullable unique)</w:t>
             </w:r>
           </w:p>
         </w:tc>
@@ -2164,8 +2090,7 @@
     </w:p>
     <w:p>
       <w:r>
-        <w:rPr/>
-        <w:t>Order item giữ product_name và price tại thời điểm mua. Việc đổi tên hoặc giá sản phẩm sau đó không được làm thay đổi thông tin đơn cũ. Checkout sẽ tính tiền từ DB và tạo đơn/trừ kho trong transaction; chức năng này chưa triển khai trong bộ khung.</w:t>
+        <w:t>Order item giữ product_name và price tại thời điểm mua. Checkout lấy giá DB, tính tiền bằng số nguyên theo phần trăm đơn vị tiền, ghi đơn và trừ kho trong transaction có khóa hàng. orders.checkout_token là UUID unique để chống gửi lặp.</w:t>
       </w:r>
     </w:p>
     <w:p>
@@ -2178,8 +2103,7 @@
     </w:p>
     <w:p>
       <w:r>
-        <w:rPr/>
-        <w:t>Các giá trị thống nhất là pending (chờ xác nhận), processing (đang giao), completed (hoàn thành) và cancelled (đã hủy). Lộ trình chính là pending → processing → completed. Quy tắc hủy, hoàn kho và chống gửi lặp checkout cần thống nhất trước khi thành viên 3 triển khai.</w:t>
+        <w:t>Trạng thái gồm pending, processing, completed và cancelled. Luồng chính pending → processing → completed. Customer hủy đơn của mình khi pending; Admin hủy pending/processing. Không hủy completed. Hủy khóa đơn và sản phẩm, hoàn kho đúng một lần; gửi lại không hoàn thêm, lỗi giữa chừng rollback.</w:t>
       </w:r>
     </w:p>
     <w:p>
@@ -2197,8 +2121,7 @@
     </w:p>
     <w:p>
       <w:r>
-        <w:rPr/>
-        <w:t>Khách vãng lai sử dụng các chức năng công khai. Khách hàng có thêm các chức năng tài khoản và mua hàng. Các oval biểu diễn phạm vi dự kiến, không đồng nghĩa tất cả chức năng đã được lập trình.</w:t>
+        <w:t>Khách vãng lai dùng chức năng công khai; Customer có tài khoản, giỏ, checkout COD và lịch sử đơn của mình. Các module đã tích hợp; trạng thái nghiệm thu riêng xem checklist. Chức năng hủy được bổ sung: Customer ở pending, Admin ở pending/processing.</w:t>
       </w:r>
     </w:p>
     <w:p>
@@ -2374,13 +2297,12 @@
         <w:pStyle w:val="Heading2"/>
       </w:pPr>
       <w:r>
-        <w:t>4 2 Danh mục và sản phẩm dự kiến</w:t>
+        <w:t>4 2 Danh mục và sản phẩm</w:t>
       </w:r>
     </w:p>
     <w:p>
       <w:r>
-        <w:rPr/>
-        <w:t>Thành viên 2 xây dựng CRUD danh mục/sản phẩm, upload ảnh và Form Request Validation. Xóa danh mục còn sản phẩm hoặc sản phẩm đã có trong đơn phải trả thông báo rõ ràng. Ảnh lưu ở public disk và truy cập bằng storage link; bộ khung hiện dùng ảnh placeholder.</w:t>
+        <w:t>Đã có CRUD danh mục/sản phẩm, upload ảnh và Form Request Validation. Dữ liệu mẫu gồm 8 danh mục, 60 sản phẩm có ảnh. Seeder chạy lại không đặt lại giá/tồn kho/ảnh đã chỉnh; bổ sung ảnh mẫu cho bản ghi cũ chưa có ảnh. Danh mục còn sản phẩm và sản phẩm đã có trong đơn bị chặn xóa.</w:t>
       </w:r>
     </w:p>
     <w:p>
@@ -2388,19 +2310,17 @@
         <w:pStyle w:val="Heading2"/>
       </w:pPr>
       <w:r>
-        <w:t>4 3 Giỏ hàng và checkout dự kiến</w:t>
+        <w:t>4 3 Giỏ hàng và checkout</w:t>
       </w:r>
     </w:p>
     <w:p>
       <w:r>
-        <w:rPr/>
-        <w:t>Thành viên 4 làm Cart Session và Fetch API thêm, cập nhật, xóa sản phẩm. Server xác minh product_id, số lượng và tồn kho; giao diện cập nhật badge/tổng tiền sau response. Thành viên 3 làm checkout, chỉ cho khách đã đăng nhập, xác minh thông tin giao hàng rồi tính tổng từ giá DB.</w:t>
+        <w:t>Cart Session và Fetch API hỗ trợ thêm, cập nhật, xóa và đồng bộ badge/tổng tiền. Checkout yêu cầu đăng nhập và xác minh thông tin giao hàng; dùng giá, quyền sở hữu và tồn kho từ DB, không tin giá/tổng/user/status do trình duyệt gửi.</w:t>
       </w:r>
     </w:p>
     <w:p>
       <w:r>
-        <w:rPr/>
-        <w:t>Checkout phải dùng transaction và khóa dữ liệu tồn kho để tránh bán vượt số lượng khi hai khách đặt đồng thời. Chỉ xóa giỏ sau khi đơn tạo thành công. Các bước chống gửi lặp, hủy/hoàn kho và xử lý giỏ khi đăng nhập/đăng xuất cần được thống nhất khi tích hợp.</w:t>
+        <w:t>Checkout ghi đơn/items, lưu snapshot giá/tên và trừ kho trong transaction; chỉ xóa giỏ khi thành công. Token duy nhất chống gửi lặp. Hủy cũng dùng transaction và khóa dữ liệu, không hoàn kho hai lần. Đăng xuất hủy session; hệ thống hiện không giữ giỏ qua đăng xuất.</w:t>
       </w:r>
     </w:p>
     <w:p>
@@ -2408,13 +2328,12 @@
         <w:pStyle w:val="Heading2"/>
       </w:pPr>
       <w:r>
-        <w:t>4 4 Đơn hàng và chức năng tương tác dự kiến</w:t>
+        <w:t>4 4 Đơn hàng và chức năng tương tác</w:t>
       </w:r>
     </w:p>
     <w:p>
       <w:r>
-        <w:rPr/>
-        <w:t>Thành viên 3 triển khai lịch sử đơn cá nhân và quản lý trạng thái đơn Admin. Thành viên 4 bổ sung live search có giới hạn kết quả, thông báo SweetAlert2 và API ngoài có xử lý timeout/lỗi. Tìm kiếm/phân trang giữ bộ lọc khi chuyển trang; layout cần dùng được trên điện thoại.</w:t>
+        <w:t>Khách xem lịch sử và chi tiết qua quan hệ orders của user hiện tại. Admin xử lý và hủy đơn theo trạng thái. Trang khách có bộ lọc, tìm kiếm và phân trang 8 sản phẩm, giữ query string. Live search giới hạn gợi ý, SweetAlert2 dùng văn bản an toàn. Widget thời tiết đã nhận dữ liệu trong lượt thử browser.</w:t>
       </w:r>
     </w:p>
     <w:p>
@@ -2427,7 +2346,7 @@
         <w:pStyle w:val="Heading1"/>
       </w:pPr>
       <w:r>
-        <w:t>5 Triển khai và kiểm thử nền tảng</w:t>
+        <w:t>5 Triển khai và kiểm thử tích hợp</w:t>
       </w:r>
     </w:p>
     <w:p>
@@ -2637,15 +2556,8 @@
             <w:vAlign w:val="center"/>
           </w:tcPr>
           <w:p>
-            <w:pPr>
-              <w:spacing w:after="60" w:line="252" w:lineRule="auto"/>
-            </w:pPr>
             <w:r>
-              <w:rPr>
-                <w:b w:val="0"/>
-                <w:sz w:val="22"/>
-              </w:rPr>
-              <w:t>MySQL 8.4.3; smartcart_db trên máy thành viên 1</w:t>
+              <w:t>MySQL 8.4.3; database ứng dụng và test tách biệt</w:t>
             </w:r>
           </w:p>
         </w:tc>
@@ -2771,15 +2683,8 @@
             <w:vAlign w:val="center"/>
           </w:tcPr>
           <w:p>
-            <w:pPr>
-              <w:spacing w:after="60" w:line="252" w:lineRule="auto"/>
-            </w:pPr>
             <w:r>
-              <w:rPr>
-                <w:b w:val="0"/>
-                <w:sz w:val="22"/>
-              </w:rPr>
-              <w:t>2 tài khoản demo, 5 danh mục, 30 sản phẩm</w:t>
+              <w:t>2 tài khoản demo, 8 danh mục, 60 sản phẩm có ảnh</w:t>
             </w:r>
           </w:p>
         </w:tc>
@@ -2838,15 +2743,8 @@
             <w:vAlign w:val="center"/>
           </w:tcPr>
           <w:p>
-            <w:pPr>
-              <w:spacing w:after="60" w:line="252" w:lineRule="auto"/>
-            </w:pPr>
             <w:r>
-              <w:rPr>
-                <w:b w:val="0"/>
-                <w:sz w:val="22"/>
-              </w:rPr>
-              <w:t>GitHub main; README; docs/TEAM.md, ERD.md, USE_CASE.md</w:t>
+              <w:t>GitHub integration/admin-cart; các tài liệu cài đặt, nghiệm thu và thuyết trình</w:t>
             </w:r>
           </w:p>
         </w:tc>
@@ -2873,14 +2771,12 @@
     </w:p>
     <w:p>
       <w:r>
-        <w:rPr/>
-        <w:t>Bộ khung được kiểm tra bằng 16 test với 84 assertions trên SQLite in-memory và MySQL test riêng; tất cả đều qua ở lần kiểm tra nền tảng ngày 13/10/2026. Phạm vi bao gồm Auth, validation, phân quyền, chống tự nâng role, giới hạn đăng nhập, seeder chạy lại và quan hệ/khóa ngoại.</w:t>
+        <w:t>Bản ae4649a có 79 test, 636 assertions đạt trên SQLite và MySQL test riêng. Bản 316a2ac bổ sung sửa header mobile Admin. Cài sạch từ GitHub trên cùng máy, composer install từ lock 115 gói, check-platform-reqs, migration, seed hai lần và storage link đều thành công; không copy vendor hay .env cũ.</w:t>
       </w:r>
     </w:p>
     <w:p>
       <w:r>
-        <w:rPr/>
-        <w:t>Kiểm tra trình duyệt xác nhận đăng nhập Admin/Customer, truy cập trang tài khoản/tổng quan, Customer nhận 403 ở trang Admin và thao tác đăng xuất. Những kết quả này không xác nhận các module CRUD/checkout/giỏ hàng chưa được triển khai.</w:t>
+        <w:t>Browser ngày 18/10 đã thử đăng nhập Customer/Admin, thêm/tăng số lượng giỏ, checkout mobile, Admin chuyển đơn sang hoàn thành, hủy đơn đang giao và khách xem lại lịch sử. SQL xác nhận đơn 1 completed 190.000 đồng, đơn 2 cancelled 95.000 đồng; stock sản phẩm thử 35 → 33 → 32 → 33; doanh thu completed 190.000 đồng.</w:t>
       </w:r>
     </w:p>
     <w:p>
@@ -2888,19 +2784,17 @@
         <w:pStyle w:val="Heading2"/>
       </w:pPr>
       <w:r>
-        <w:t>5 3 Kiểm thử sau tích hợp</w:t>
+        <w:t>5 3 Phạm vi bằng chứng và nghiệm thu còn mở</w:t>
       </w:r>
     </w:p>
     <w:p>
       <w:r>
-        <w:rPr/>
-        <w:t>Checklist trong docs/TEST_CHECKLIST.md bao gồm cài trên máy mới, CRUD/upload ảnh, bộ lọc và phân trang, giỏ hàng, checkout, cạnh tranh tồn kho, quyền truy cập đơn, trạng thái/hủy đơn, API, CSRF, XSS và responsive. Mỗi ca cần ghi commit, người kiểm tra, kết quả thực tế và bằng chứng; chỉ đánh Pass khi đã chạy.</w:t>
+        <w:t>Checklist ghi rõ test tự động, browser, SQL và các ca chưa chạy. Hai ca cạnh tranh hủy cùng đơn/hủy so với hoàn thành đã đạt trong review MySQL ae4649a; không tính vào bộ 79 test đã commit. POST login/cart-add/checkout thiếu CSRF trả 419. Không suy rộng thành mọi trang, mọi thiết bị đều đạt.</w:t>
       </w:r>
     </w:p>
     <w:p>
       <w:r>
-        <w:rPr/>
-        <w:t>Ảnh giao diện đầy đủ và biên bản kiểm thử toàn hệ thống sẽ bổ sung sau khi ghép code. Chạy thử clone và migrate --seed trên máy khác là bước bắt buộc trước buổi demo của nhóm.</w:t>
+        <w:t>Ảnh demo được lưu ở docs/demo. Máy thứ hai chờ thành viên cài theo docs/INSTALL_ACCEPTANCE.md và gửi biên bản. Các ca upload/UI, API lỗi/timeout và các mục chưa đủ bằng chứng vẫn giữ trạng thái chờ. Chưa gộp main khi nghiệm thu còn mở.</w:t>
       </w:r>
     </w:p>
     <w:p>
@@ -3434,8 +3328,7 @@
     </w:p>
     <w:p>
       <w:r>
-        <w:rPr/>
-        <w:t>Mỗi thành viên clone main, tự tạo nhánh cho module và commit bằng tài khoản cá nhân. Pull Request mô tả chức năng và kết quả kiểm tra; trưởng nhóm review rồi merge. Không sửa lại migration đã bàn giao, cần thêm migration mới khi thay đổi schema.</w:t>
+        <w:t>Các module được ghép trên integration/admin-cart từ các nhánh cá nhân; lịch sử commit của các thành viên được giữ lại. Chỉ gộp main sau nghiệm thu. Khi schema đổi, thêm migration mới; checkout_token đã có migration riêng. Kịch bản cho bốn người nằm ở docs/PRESENTATION_SCRIPT.md.</w:t>
       </w:r>
     </w:p>
     <w:p>
@@ -3448,8 +3341,7 @@
     </w:p>
     <w:p>
       <w:r>
-        <w:rPr/>
-        <w:t>Nhóm điền lớp, giảng viên, họ tên/MSSV còn trống; xác nhận phân công thực tế; hoàn thiện module; chèn ảnh giao diện và luồng demo; cập nhật bảng kết quả kiểm thử; ghi hạn chế thực tế và kết luận sau khi nghiệm thu. Không ghi các chức năng dự kiến thành kết quả đã hoàn thành.</w:t>
+        <w:t>Nhóm điền lớp, giảng viên, họ tên/MSSV còn trống; gửi kết quả máy thứ hai, hoàn thành các ca nghiệm thu còn mở và kiểm tra bố cục Word/PDF trước khi nộp. Nội dung nghiệm thu và ảnh đã cập nhật, không đánh dấu đạt các mục chưa chạy.</w:t>
       </w:r>
     </w:p>
     <w:p>
@@ -3494,6 +3386,232 @@
       <w:r>
         <w:rPr/>
         <w:t>Bootstrap 5.3: https://getbootstrap.com/docs/5.3/</w:t>
+      </w:r>
+    </w:p>
+    <w:p>
+      <w:r>
+        <w:br w:type="page"/>
+      </w:r>
+    </w:p>
+    <w:p>
+      <w:pPr>
+        <w:pStyle w:val="Heading1"/>
+      </w:pPr>
+      <w:r>
+        <w:t>7 Ảnh demo bản tích hợp</w:t>
+      </w:r>
+    </w:p>
+    <w:p>
+      <w:r>
+        <w:t>Ảnh chụp trình duyệt ngày 18/10/2026 trên database thử riêng, dữ liệu giao hàng giả. Mã nghiệp vụ 316a2ac.</w:t>
+      </w:r>
+    </w:p>
+    <w:p>
+      <w:pPr>
+        <w:pStyle w:val="Heading2"/>
+      </w:pPr>
+      <w:r>
+        <w:t>7 1 Trang chủ</w:t>
+      </w:r>
+    </w:p>
+    <w:p>
+      <w:r>
+        <w:drawing>
+          <wp:inline xmlns:a="http://schemas.openxmlformats.org/drawingml/2006/main" xmlns:pic="http://schemas.openxmlformats.org/drawingml/2006/picture">
+            <wp:extent cx="5486400" cy="3430444"/>
+            <wp:docPr id="4" name="Picture 4"/>
+            <wp:cNvGraphicFramePr>
+              <a:graphicFrameLocks noChangeAspect="1"/>
+            </wp:cNvGraphicFramePr>
+            <a:graphic>
+              <a:graphicData uri="http://schemas.openxmlformats.org/drawingml/2006/picture">
+                <pic:pic>
+                  <pic:nvPicPr>
+                    <pic:cNvPr id="0" name="01-home-desktop.png"/>
+                    <pic:cNvPicPr/>
+                  </pic:nvPicPr>
+                  <pic:blipFill>
+                    <a:blip r:embed="rId13"/>
+                    <a:stretch>
+                      <a:fillRect/>
+                    </a:stretch>
+                  </pic:blipFill>
+                  <pic:spPr>
+                    <a:xfrm>
+                      <a:off x="0" y="0"/>
+                      <a:ext cx="5486400" cy="3430444"/>
+                    </a:xfrm>
+                    <a:prstGeom prst="rect"/>
+                  </pic:spPr>
+                </pic:pic>
+              </a:graphicData>
+            </a:graphic>
+          </wp:inline>
+        </w:drawing>
+      </w:r>
+    </w:p>
+    <w:p>
+      <w:pPr>
+        <w:pStyle w:val="Caption"/>
+      </w:pPr>
+      <w:r>
+        <w:t>Có bộ lọc, danh sách mẫu và điều hướng khách hàng.</w:t>
+      </w:r>
+    </w:p>
+    <w:p>
+      <w:pPr>
+        <w:pStyle w:val="Heading2"/>
+      </w:pPr>
+      <w:r>
+        <w:t>7 2 Checkout trên mobile</w:t>
+      </w:r>
+    </w:p>
+    <w:p>
+      <w:r>
+        <w:drawing>
+          <wp:inline xmlns:a="http://schemas.openxmlformats.org/drawingml/2006/main" xmlns:pic="http://schemas.openxmlformats.org/drawingml/2006/picture">
+            <wp:extent cx="2560320" cy="5540248"/>
+            <wp:docPr id="5" name="Picture 5"/>
+            <wp:cNvGraphicFramePr>
+              <a:graphicFrameLocks noChangeAspect="1"/>
+            </wp:cNvGraphicFramePr>
+            <a:graphic>
+              <a:graphicData uri="http://schemas.openxmlformats.org/drawingml/2006/picture">
+                <pic:pic>
+                  <pic:nvPicPr>
+                    <pic:cNvPr id="0" name="03-checkout-mobile.png"/>
+                    <pic:cNvPicPr/>
+                  </pic:nvPicPr>
+                  <pic:blipFill>
+                    <a:blip r:embed="rId14"/>
+                    <a:stretch>
+                      <a:fillRect/>
+                    </a:stretch>
+                  </pic:blipFill>
+                  <pic:spPr>
+                    <a:xfrm>
+                      <a:off x="0" y="0"/>
+                      <a:ext cx="2560320" cy="5540248"/>
+                    </a:xfrm>
+                    <a:prstGeom prst="rect"/>
+                  </pic:spPr>
+                </pic:pic>
+              </a:graphicData>
+            </a:graphic>
+          </wp:inline>
+        </w:drawing>
+      </w:r>
+    </w:p>
+    <w:p>
+      <w:pPr>
+        <w:pStyle w:val="Caption"/>
+      </w:pPr>
+      <w:r>
+        <w:t>Viewport 375×812; thông tin giao hàng và tổng tiền của đơn thử.</w:t>
+      </w:r>
+    </w:p>
+    <w:p>
+      <w:pPr>
+        <w:pStyle w:val="Heading2"/>
+      </w:pPr>
+      <w:r>
+        <w:t>7 3 Admin hủy đơn</w:t>
+      </w:r>
+    </w:p>
+    <w:p>
+      <w:r>
+        <w:drawing>
+          <wp:inline xmlns:a="http://schemas.openxmlformats.org/drawingml/2006/main" xmlns:pic="http://schemas.openxmlformats.org/drawingml/2006/picture">
+            <wp:extent cx="5486400" cy="3429000"/>
+            <wp:docPr id="6" name="Picture 6"/>
+            <wp:cNvGraphicFramePr>
+              <a:graphicFrameLocks noChangeAspect="1"/>
+            </wp:cNvGraphicFramePr>
+            <a:graphic>
+              <a:graphicData uri="http://schemas.openxmlformats.org/drawingml/2006/picture">
+                <pic:pic>
+                  <pic:nvPicPr>
+                    <pic:cNvPr id="0" name="06-admin-cancelled.png"/>
+                    <pic:cNvPicPr/>
+                  </pic:nvPicPr>
+                  <pic:blipFill>
+                    <a:blip r:embed="rId15"/>
+                    <a:stretch>
+                      <a:fillRect/>
+                    </a:stretch>
+                  </pic:blipFill>
+                  <pic:spPr>
+                    <a:xfrm>
+                      <a:off x="0" y="0"/>
+                      <a:ext cx="5486400" cy="3429000"/>
+                    </a:xfrm>
+                    <a:prstGeom prst="rect"/>
+                  </pic:spPr>
+                </pic:pic>
+              </a:graphicData>
+            </a:graphic>
+          </wp:inline>
+        </w:drawing>
+      </w:r>
+    </w:p>
+    <w:p>
+      <w:pPr>
+        <w:pStyle w:val="Caption"/>
+      </w:pPr>
+      <w:r>
+        <w:t>Đơn 2 đã hủy; SQL xác nhận hoàn lại 1 sản phẩm. Đơn 1 hoàn thành và doanh thu là 190.000 đồng.</w:t>
+      </w:r>
+    </w:p>
+    <w:p>
+      <w:pPr>
+        <w:pStyle w:val="Heading2"/>
+      </w:pPr>
+      <w:r>
+        <w:t>7 4 Mobile Admin sau chỉnh sửa</w:t>
+      </w:r>
+    </w:p>
+    <w:p>
+      <w:r>
+        <w:drawing>
+          <wp:inline xmlns:a="http://schemas.openxmlformats.org/drawingml/2006/main" xmlns:pic="http://schemas.openxmlformats.org/drawingml/2006/picture">
+            <wp:extent cx="2560320" cy="5543946"/>
+            <wp:docPr id="7" name="Picture 7"/>
+            <wp:cNvGraphicFramePr>
+              <a:graphicFrameLocks noChangeAspect="1"/>
+            </wp:cNvGraphicFramePr>
+            <a:graphic>
+              <a:graphicData uri="http://schemas.openxmlformats.org/drawingml/2006/picture">
+                <pic:pic>
+                  <pic:nvPicPr>
+                    <pic:cNvPr id="0" name="07-admin-mobile.png"/>
+                    <pic:cNvPicPr/>
+                  </pic:nvPicPr>
+                  <pic:blipFill>
+                    <a:blip r:embed="rId16"/>
+                    <a:stretch>
+                      <a:fillRect/>
+                    </a:stretch>
+                  </pic:blipFill>
+                  <pic:spPr>
+                    <a:xfrm>
+                      <a:off x="0" y="0"/>
+                      <a:ext cx="2560320" cy="5543946"/>
+                    </a:xfrm>
+                    <a:prstGeom prst="rect"/>
+                  </pic:spPr>
+                </pic:pic>
+              </a:graphicData>
+            </a:graphic>
+          </wp:inline>
+        </w:drawing>
+      </w:r>
+    </w:p>
+    <w:p>
+      <w:pPr>
+        <w:pStyle w:val="Caption"/>
+      </w:pPr>
+      <w:r>
+        <w:t>Viewport 375×812; không tràn cả trang, bảng cuộn trong khung.</w:t>
       </w:r>
     </w:p>
     <w:sectPr>

</xml_diff>